<commit_message>
docs: finished IPERKA inform part and startet planning phase
</commit_message>
<xml_diff>
--- a/Dokumente/IPA_Bericht_Ruben_Schneebeli_V1.docx
+++ b/Dokumente/IPA_Bericht_Ruben_Schneebeli_V1.docx
@@ -12469,13 +12469,34 @@
         <w:t>und Bearbeitung</w:t>
       </w:r>
       <w:r>
-        <w:t xml:space="preserve">. Das Backend stellt eine REST-API mit drei Service-Gruppen bereit (User, Template, Document), das Frontend ist in React mit TypeScript </w:t>
+        <w:t xml:space="preserve">. Das Backend </w:t>
+      </w:r>
+      <w:r>
+        <w:t>besteht aus</w:t>
+      </w:r>
+      <w:r>
+        <w:t xml:space="preserve"> eine</w:t>
+      </w:r>
+      <w:r>
+        <w:t>r</w:t>
+      </w:r>
+      <w:r>
+        <w:t xml:space="preserve"> REST-API mit drei Service-Gruppen (User, Template, Document), das Frontend ist in React mit TypeScript </w:t>
       </w:r>
       <w:r>
         <w:t>geschrieben</w:t>
       </w:r>
       <w:r>
-        <w:t xml:space="preserve"> und die Daten werden in einer PostgreSQL-Datenbank persistiert. Alle drei Komponenten laufen in separaten Docker-Containern und werden über eine docker-compose.yml </w:t>
+        <w:t xml:space="preserve"> und die Daten werden in einer PostgreSQL-Datenbank </w:t>
+      </w:r>
+      <w:r>
+        <w:t>abgespeichert</w:t>
+      </w:r>
+      <w:r>
+        <w:t xml:space="preserve">. Alle drei Komponenten laufen in separaten Docker-Containern und werden über ein docker-compose.yml </w:t>
+      </w:r>
+      <w:r>
+        <w:t xml:space="preserve">File </w:t>
       </w:r>
       <w:r>
         <w:t>verwaltet</w:t>

</xml_diff>